<commit_message>
Gebrauchsanweisungen aktualisiert + AI-Vokabelfilter
- Stimmeinstellungen auf Startseite dokumentiert (Abschnitt 1)
- Gespeicherte Vokabeln laden beschrieben (Abschnitt 2.1, 6)
- Auto-Export als JSON dokumentiert (Abschnitt 6)
- AI-Vokabelfilter: Bindestriche und lange Textabsaetze werden gefiltert
- DOCX-Generierung: Ausgabepfad korrigiert, alle 3 Sprachen aktualisiert

Co-Authored-By: Claude Opus 4.6 <noreply@anthropic.com>
</commit_message>
<xml_diff>
--- a/Vokabeltrainer/Gebrauchsanweisung.docx
+++ b/Vokabeltrainer/Gebrauchsanweisung.docx
@@ -70,7 +70,23 @@
         <w:pStyle w:val="ListNumber"/>
       </w:pPr>
       <w:r>
-        <w:t>Auf dem Startbildschirm sehen Sie zwei große Schaltflächen: Karteikarten und Texte vorlesen.</w:t>
+        <w:t>Auf dem Startbildschirm sehen Sie:</w:t>
+      </w:r>
+    </w:p>
+    <w:p>
+      <w:pPr>
+        <w:pStyle w:val="ListBullet2"/>
+      </w:pPr>
+      <w:r>
+        <w:t>Zwei große Schaltflächen: Karteikarten (das Kartensymbol) und Texte vorlesen (das Buchsymbol)</w:t>
+      </w:r>
+    </w:p>
+    <w:p>
+      <w:pPr>
+        <w:pStyle w:val="ListBullet2"/>
+      </w:pPr>
+      <w:r>
+        <w:t>Darunter die Stimmeinstellungen: Wählen Sie bereits hier Geschlecht, Stimme und Tempo für die Sprachausgabe — diese Einstellungen gelten für beide Modi.</w:t>
       </w:r>
     </w:p>
     <w:p>
@@ -78,7 +94,7 @@
         <w:pStyle w:val="ListNumber"/>
       </w:pPr>
       <w:r>
-        <w:t>Oben können Sie die Sprache der Benutzeroberfläche umschalten: DE (Deutsch), EN (Englisch) oder RU (Russisch).</w:t>
+        <w:t>Oben rechts können Sie die Sprache der Benutzeroberfläche umschalten: DE (Deutsch), EN (Englisch) oder RU (Russisch).</w:t>
       </w:r>
     </w:p>
     <w:p>
@@ -94,12 +110,50 @@
         <w:pStyle w:val="Heading2"/>
       </w:pPr>
       <w:r>
-        <w:t>2.1 Datei laden</w:t>
+        <w:t>2.1 Vokabeln laden</w:t>
       </w:r>
     </w:p>
     <w:p>
       <w:r>
-        <w:t>Klicken Sie auf Karteikarten und laden Sie eine Textdatei mit Ihren Vokabeln. Sie können die Datei entweder per Drag &amp; Drop in den Bereich ziehen oder durch Klick die Datei auswählen. Die App merkt sich den zuletzt verwendeten Ordner, sodass der Dateidialog beim nächsten Mal dort wieder öffnet (Chrome/Edge). Die App erkennt automatisch, welches Format Ihre Datei hat (siehe Abschnitt 3).</w:t>
+        <w:t>Klicken Sie auf Karteikarten. Sie haben nun zwei Möglichkeiten:</w:t>
+      </w:r>
+    </w:p>
+    <w:p>
+      <w:r>
+        <w:rPr>
+          <w:b/>
+        </w:rPr>
+        <w:t xml:space="preserve">Neue Datei laden: </w:t>
+      </w:r>
+      <w:r>
+        <w:t>Laden Sie eine Textdatei mit Ihren Vokabeln. Sie können die Datei entweder per Drag &amp; Drop in den Bereich ziehen oder durch Klick die Datei auswählen. Die App merkt sich den zuletzt verwendeten Ordner, sodass der Dateidialog beim nächsten Mal dort wieder öffnet (Chrome/Edge). Die App erkennt automatisch, welches Format Ihre Datei hat (siehe Abschnitt 3).</w:t>
+      </w:r>
+    </w:p>
+    <w:p>
+      <w:r>
+        <w:rPr>
+          <w:b/>
+        </w:rPr>
+        <w:t xml:space="preserve">Gespeicherte Vokabeln laden: </w:t>
+      </w:r>
+      <w:r>
+        <w:t>Unterhalb des Datei-Upload-Bereichs sehen Sie die Liste Ihrer gespeicherten Vokabeln aus früheren Sitzungen (siehe Abschnitt 6). Sie können:</w:t>
+      </w:r>
+    </w:p>
+    <w:p>
+      <w:pPr>
+        <w:pStyle w:val="ListBullet"/>
+      </w:pPr>
+      <w:r>
+        <w:t>Alle Vokabeln laden — Ihre gesamte Vokabelsammlung als Karteikarten</w:t>
+      </w:r>
+    </w:p>
+    <w:p>
+      <w:pPr>
+        <w:pStyle w:val="ListBullet"/>
+      </w:pPr>
+      <w:r>
+        <w:t>Eine einzelne Lektion laden — klicken Sie auf den Titel (z.B. "Im Restaurant", "Antonyme"), um nur die Vokabeln dieser Lektion zu lernen</w:t>
       </w:r>
     </w:p>
     <w:p>
@@ -121,22 +175,6 @@
       </w:pPr>
       <w:r>
         <w:t>Lernmodus — Wählen Sie zwischen Frei, SM-2 oder FSRS (siehe Abschnitt 4)</w:t>
-      </w:r>
-    </w:p>
-    <w:p>
-      <w:pPr>
-        <w:pStyle w:val="ListBullet"/>
-      </w:pPr>
-      <w:r>
-        <w:t>Stimme — Wählen Sie eine männliche oder weibliche Stimme</w:t>
-      </w:r>
-    </w:p>
-    <w:p>
-      <w:pPr>
-        <w:pStyle w:val="ListBullet"/>
-      </w:pPr>
-      <w:r>
-        <w:t>Tempo — Passen Sie die Sprechgeschwindigkeit an (langsamer = einfacher zum Mithören)</w:t>
       </w:r>
     </w:p>
     <w:p>
@@ -827,7 +865,7 @@
         <w:pStyle w:val="ListBullet2"/>
       </w:pPr>
       <w:r>
-        <w:t>Alles — Der Text wird Satz für Satz vorgelesen. Das aktuell gesprochene Wort wird goldfarben markiert (Wort-für-Wort-Cursor). Bereits gelesene Sätze und Wörter werden ausgegraut.</w:t>
+        <w:t>ganzer Text — Der Text wird Satz für Satz vorgelesen. Das aktuell gesprochene Wort wird goldfarben markiert (Wort-für-Wort-Cursor). Bereits gelesene Sätze und Wörter werden ausgegraut.</w:t>
       </w:r>
     </w:p>
     <w:p>
@@ -835,7 +873,7 @@
         <w:pStyle w:val="ListBullet2"/>
       </w:pPr>
       <w:r>
-        <w:t>Satzweise — Jeder Satz wird einzeln vorgelesen; klicken Sie auf einen Satz, um ihn zu hören. Auch hier wird das aktuelle Wort markiert. Mit den Buttons ⏮ Voriger Satz / ⏭ Nächster Satz navigieren Sie zwischen den Sätzen.</w:t>
+        <w:t>Satz für Satz — Jeder Satz wird einzeln vorgelesen; klicken Sie auf einen Satz, um ihn zu hören. Auch hier wird das aktuelle Wort markiert. Mit den Buttons ⏮ Voriger Satz / ⏭ Nächster Satz navigieren Sie zwischen den Sätzen.</w:t>
       </w:r>
     </w:p>
     <w:p>
@@ -848,22 +886,85 @@
         <w:pStyle w:val="Heading1"/>
       </w:pPr>
       <w:r>
-        <w:t>6. Die Vokabel-Datenbank</w:t>
+        <w:t>6. Die Vokabel-Datenbank — Ihr wachsender Wortschatz</w:t>
+      </w:r>
+    </w:p>
+    <w:p>
+      <w:pPr>
+        <w:pStyle w:val="Heading2"/>
+      </w:pPr>
+      <w:r>
+        <w:t>Automatisches Sammeln</w:t>
       </w:r>
     </w:p>
     <w:p>
       <w:r>
-        <w:t>Jedes Mal, wenn Sie eine Vokabeldatei laden, werden die Karten automatisch in einer Datenbank im Browser gespeichert. Die Datenbank wächst mit jeder neuen Datei — ohne Duplikate.</w:t>
+        <w:t>Jedes Mal, wenn Sie eine Vokabeldatei laden oder Vokabeln per KI generieren lassen, werden die Karten automatisch in einer Datenbank im Browser gespeichert. Die Datenbank wächst mit jeder neuen Datei — ohne Duplikate. Jede Vokabel merkt sich, aus welcher Quelldatei (Lektion) sie stammt.</w:t>
+      </w:r>
+    </w:p>
+    <w:p>
+      <w:pPr>
+        <w:pStyle w:val="Heading2"/>
+      </w:pPr>
+      <w:r>
+        <w:t>Gespeicherte Vokabeln laden und lernen</w:t>
       </w:r>
     </w:p>
     <w:p>
       <w:r>
-        <w:t>Klicken Sie auf Export (Excel), um Ihre gesamte Vokabelsammlung als TSV-Datei herunterzuladen. Diese Datei können Sie direkt in Excel oder Google Sheets öffnen.</w:t>
+        <w:t>Wenn Sie im Hauptmenü auf Karteikarten klicken, sehen Sie unterhalb des Datei-Upload-Bereichs Ihre gespeicherten Vokabeln:</w:t>
+      </w:r>
+    </w:p>
+    <w:p>
+      <w:pPr>
+        <w:pStyle w:val="ListBullet"/>
+      </w:pPr>
+      <w:r>
+        <w:t>Alle Vokabeln (N Karten) — Lädt Ihre gesamte Vokabelsammlung als Karteikarten. Ideal für gemischtes Wiederholen.</w:t>
+      </w:r>
+    </w:p>
+    <w:p>
+      <w:pPr>
+        <w:pStyle w:val="ListBullet"/>
+      </w:pPr>
+      <w:r>
+        <w:t>Einzelne Lektionen — Jede Datei, die Sie jemals geladen haben, erscheint als eigener Eintrag mit Kartenzähler. Klicken Sie auf eine Lektion, um nur deren Vokabeln zu lernen.</w:t>
+      </w:r>
+    </w:p>
+    <w:p>
+      <w:r>
+        <w:t>So können Sie gezielt bestimmte Themen wiederholen, ohne die Originaldatei erneut laden zu müssen. Der Lernfortschritt (Spaced Repetition) bleibt dabei erhalten.</w:t>
+      </w:r>
+    </w:p>
+    <w:p>
+      <w:pPr>
+        <w:pStyle w:val="Heading2"/>
+      </w:pPr>
+      <w:r>
+        <w:t>Export für Excel</w:t>
+      </w:r>
+    </w:p>
+    <w:p>
+      <w:r>
+        <w:t>Klicken Sie im Einstellungsbildschirm auf Export (Excel), um Ihre gesamte Vokabelsammlung als CSV-Datei herunterzuladen. Diese Datei können Sie direkt in Excel oder Google Sheets öffnen.</w:t>
       </w:r>
     </w:p>
     <w:p>
       <w:r>
         <w:t>Die Exportdatei enthält: Russisch, Deutsch, Thema, Kategorie, Grammatik und Quelle (Dateiname).</w:t>
+      </w:r>
+    </w:p>
+    <w:p>
+      <w:pPr>
+        <w:pStyle w:val="Heading2"/>
+      </w:pPr>
+      <w:r>
+        <w:t>Auto-Export als JSON</w:t>
+      </w:r>
+    </w:p>
+    <w:p>
+      <w:r>
+        <w:t>In den Einstellungen (Zahnrad-Symbol oben rechts) können Sie einen Speicherort für eine JSON-Datei wählen. Die App exportiert dann bei jeder Änderung automatisch Ihre gesamte Vokabelsammlung in diese Datei. So haben Sie immer ein aktuelles Backup.</w:t>
       </w:r>
     </w:p>
     <w:p>

</xml_diff>